<commit_message>
Bloco F: enxuga o parágrafo do chifre
Co-Authored-By: Claude Fable 5.1 <noreply@anthropic.com>
Claude-Session: https://claude.ai/code/session_017HYp1xhSzB6Ui5hyJvLbGE
</commit_message>
<xml_diff>
--- a/analise-ed/copy/VSL_SodaFil_08_Tese_F.docx
+++ b/analise-ed/copy/VSL_SodaFil_08_Tese_F.docx
@@ -150,7 +150,7 @@
         <w:t xml:space="preserve"> </w:t>
       </w:r>
       <w:r>
-        <w:t xml:space="preserve">3564 caracteres falados em EN (SH 16: 3.400 em PT).</w:t>
+        <w:t xml:space="preserve">3519 caracteres falados em EN (SH 16: 3.400 em PT).</w:t>
       </w:r>
       <w:r>
         <w:t xml:space="preserve"> </w:t>
@@ -202,7 +202,7 @@
         <w:pStyle w:val="BodyText"/>
       </w:pPr>
       <w:r>
-        <w:t xml:space="preserve">Because when the cement comes out, it leaves the sponge empty. Full of holes. Weak. That poison spent 30 years eating the elastic collagen out of it, and what’s left is a sponge that’s soft, loose, with nothing holding it up. In other words, if you stop here, you get hard. But soft, and with no size. That’s why the second thing has to come: rebuild. And there’s only one material for it. Hydrolyzed collagen from the horn of a Longhorn breeding bull. And don’t bring me the little jar for wrinkles. That stuff is cowhide, off a feedlot steer slaughtered at 18 months. Your stomach acid destroys it before you absorb a thing, and the only thing that grows is the lab’s profit. Look at the two labels. Then look at this. Because the Longhorn has one thing no other animal has. A man stops making elastic collagen at 25. The Longhorn never stops. His whole life, he keeps renewing it in his tendons, in his tissue, and most of all in the core of that horn. The one part of him that never stops growing, from his first day to his last. Over a hundred inches, and still going. That same collagen is what pushes the horn out, and it’s what keeps his equipment switched on. That’s why he mounts at 18 the way he did at 3. And only that collagen gets past your stomach and switches the rebuilding back on.</w:t>
+        <w:t xml:space="preserve">Because when the cement comes out, it leaves the sponge empty. Full of holes. Weak. That poison spent 30 years eating the elastic collagen out of it, and what’s left is a sponge that’s soft, loose, with nothing holding it up. In other words, if you stop here, you get hard. But soft, and with no size. That’s why the second thing has to come: rebuild. And there’s only one material for it. Hydrolyzed collagen from the horn of a Longhorn breeding bull. And don’t bring me the little jar for wrinkles. That stuff is cowhide, off a feedlot steer slaughtered at 18 months. Your stomach acid destroys it before you absorb a thing, and the only thing that grows is the lab’s profit. Look at the two labels. Then look at this. Because the Longhorn has one thing no other animal has. A man stops making elastic collagen at 25. The Longhorn never stops. His whole life, he keeps renewing it, and most of all in the core of that horn. The one part of him that never stops growing, from his first day to his last. Over a hundred inches, and still going. That same collagen pushes the horn out, and it keeps his equipment switched on. That’s why he mounts at 18 the way he did at 3. And only that collagen gets past your stomach and switches the rebuilding back on.</w:t>
       </w:r>
     </w:p>
     <w:p>
@@ -263,7 +263,7 @@
         <w:pStyle w:val="BodyText"/>
       </w:pPr>
       <w:r>
-        <w:t xml:space="preserve">Porque quando o cimento sai, ele deixa a esponja vazia. Cheia de furos. Fraca. Aquele veneno passou 30 anos comendo o colágeno elástico dela, e o que sobra é uma esponja mole, solta, sem nada que sustente. Em outras palavras, se você parar aqui, você fica duro. Mas mole, e sem tamanho. Por isso a segunda coisa tem que vir: reconstruir. E só existe um material pra isso. Colágeno hidrolisado do chifre de um touro reprodutor Longhorn. E não me venha com o potinho pra ruga. Aquilo é couro de boi, de novilho de confinamento abatido com 18 meses. O ácido do seu estômago destrói antes de você absorver qualquer coisa, e a única coisa que cresce é o lucro do laboratório. Olha os dois rótulos. Agora olha isso. Porque o Longhorn tem uma coisa que nenhum outro animal tem. O homem para de fabricar colágeno elástico aos 25. O Longhorn nunca para. A vida inteira ele renova esse colágeno nos tendões, nos tecidos, e principalmente no núcleo daquele chifre. A única parte dele que nunca para de crescer, do primeiro dia de vida ao último. Mais de cem polegadas, e ainda crescendo. É esse mesmo colágeno que empurra o chifre pra fora, e é ele que mantém o aparelho dele ligado. É por isso que ele monta aos 18 do jeito que montava aos 3. E só esse colágeno passa do seu estômago e religa a reconstrução.</w:t>
+        <w:t xml:space="preserve">Porque quando o cimento sai, ele deixa a esponja vazia. Cheia de furos. Fraca. Aquele veneno passou 30 anos comendo o colágeno elástico dela, e o que sobra é uma esponja mole, solta, sem nada que sustente. Em outras palavras, se você parar aqui, você fica duro. Mas mole, e sem tamanho. Por isso a segunda coisa tem que vir: reconstruir. E só existe um material pra isso. Colágeno hidrolisado do chifre de um touro reprodutor Longhorn. E não me venha com o potinho pra ruga. Aquilo é couro de boi, de novilho de confinamento abatido com 18 meses. O ácido do seu estômago destrói antes de você absorver qualquer coisa, e a única coisa que cresce é o lucro do laboratório. Olha os dois rótulos. Agora olha isso. Porque o Longhorn tem uma coisa que nenhum outro animal tem. O homem para de fabricar colágeno elástico aos 25. O Longhorn nunca para. A vida inteira ele renova esse colágeno, e principalmente no núcleo daquele chifre. A única parte dele que nunca para de crescer, do primeiro dia de vida ao último. Mais de cem polegadas, e ainda crescendo. Esse mesmo colágeno empurra o chifre pra fora, e mantém o aparelho dele ligado. É por isso que ele monta aos 18 do jeito que montava aos 3. E só esse colágeno passa do seu estômago e religa a reconstrução.</w:t>
       </w:r>
     </w:p>
     <w:p>
@@ -1512,7 +1512,7 @@
         <w:t xml:space="preserve"> </w:t>
       </w:r>
       <w:r>
-        <w:t xml:space="preserve">3564 caracteres falados em EN; a Soda Horse 16 tem 3.400 em português (o inglês corre ~10% mais curto no mesmo tempo de fala).</w:t>
+        <w:t xml:space="preserve">3519 caracteres falados em EN; a Soda Horse 16 tem 3.400 em português (o inglês corre ~10% mais curto no mesmo tempo de fala).</w:t>
       </w:r>
     </w:p>
     <w:bookmarkEnd w:id="22"/>

</xml_diff>